<commit_message>
feat: C-22a, C-22b: Implement APA 7 formatting configurations and validation tests
</commit_message>
<xml_diff>
--- a/app/domain/APA7 Base Template.docx
+++ b/app/domain/APA7 Base Template.docx
@@ -398,8 +398,10 @@
     </w:p>
     <w:sectPr>
       <w:headerReference w:type="default" r:id="rId9"/>
+      <w:headerReference w:type="first" r:id="rId10"/>
       <w:pgSz w:w="12240" w:h="15840"/>
       <w:cols w:space="720"/>
+      <w:titlePg/>
       <w:docGrid w:linePitch="360"/>
       <w:pgMar w:top="1440" w:right="1440" w:bottom="1440" w:left="1440" w:header="720" w:footer="720" w:gutter="0"/>
     </w:sectPr>
@@ -408,6 +410,25 @@
 </file>
 
 <file path=word/header1.xml><?xml version="1.0" encoding="utf-8"?>
+<w:hdr xmlns:m="http://schemas.openxmlformats.org/officeDocument/2006/math" xmlns:mc="http://schemas.openxmlformats.org/markup-compatibility/2006" xmlns:mo="http://schemas.microsoft.com/office/mac/office/2008/main" xmlns:mv="urn:schemas-microsoft-com:mac:vml" xmlns:o="urn:schemas-microsoft-com:office:office" xmlns:r="http://schemas.openxmlformats.org/officeDocument/2006/relationships" xmlns:v="urn:schemas-microsoft-com:vml" xmlns:w10="urn:schemas-microsoft-com:office:word" xmlns:w14="http://schemas.microsoft.com/office/word/2010/wordml" xmlns:w="http://schemas.openxmlformats.org/wordprocessingml/2006/main" xmlns:wne="http://schemas.microsoft.com/office/word/2006/wordml" xmlns:wp14="http://schemas.microsoft.com/office/word/2010/wordprocessingDrawing" xmlns:wp="http://schemas.openxmlformats.org/drawingml/2006/wordprocessingDrawing" xmlns:wpc="http://schemas.microsoft.com/office/word/2010/wordprocessingCanvas" xmlns:wpg="http://schemas.microsoft.com/office/word/2010/wordprocessingGroup" xmlns:wpi="http://schemas.microsoft.com/office/word/2010/wordprocessingInk" xmlns:wps="http://schemas.microsoft.com/office/word/2010/wordprocessingShape" mc:Ignorable="w14 wp14">
+  <w:p>
+    <w:pPr>
+      <w:pStyle w:val="Header"/>
+      <w:jc w:val="right"/>
+    </w:pPr>
+    <w:fldSimple w:instr="PAGE">
+      <w:r>
+        <w:rPr>
+          <w:rFonts w:ascii="Calibri" w:hAnsi="Calibri" w:cs="Calibri"/>
+          <w:sz w:val="22"/>
+        </w:rPr>
+      </w:r>
+    </w:fldSimple>
+  </w:p>
+</w:hdr>
+</file>
+
+<file path=word/header2.xml><?xml version="1.0" encoding="utf-8"?>
 <w:hdr xmlns:m="http://schemas.openxmlformats.org/officeDocument/2006/math" xmlns:mc="http://schemas.openxmlformats.org/markup-compatibility/2006" xmlns:mo="http://schemas.microsoft.com/office/mac/office/2008/main" xmlns:mv="urn:schemas-microsoft-com:mac:vml" xmlns:o="urn:schemas-microsoft-com:office:office" xmlns:r="http://schemas.openxmlformats.org/officeDocument/2006/relationships" xmlns:v="urn:schemas-microsoft-com:vml" xmlns:w10="urn:schemas-microsoft-com:office:word" xmlns:w14="http://schemas.microsoft.com/office/word/2010/wordml" xmlns:w="http://schemas.openxmlformats.org/wordprocessingml/2006/main" xmlns:wne="http://schemas.microsoft.com/office/word/2006/wordml" xmlns:wp14="http://schemas.microsoft.com/office/word/2010/wordprocessingDrawing" xmlns:wp="http://schemas.openxmlformats.org/drawingml/2006/wordprocessingDrawing" xmlns:wpc="http://schemas.microsoft.com/office/word/2010/wordprocessingCanvas" xmlns:wpg="http://schemas.microsoft.com/office/word/2010/wordprocessingGroup" xmlns:wpi="http://schemas.microsoft.com/office/word/2010/wordprocessingInk" xmlns:wps="http://schemas.microsoft.com/office/word/2010/wordprocessingShape" mc:Ignorable="w14 wp14">
   <w:p>
     <w:pPr>

</xml_diff>

<commit_message>
add generated scripts; misc commit to Template
</commit_message>
<xml_diff>
--- a/app/domain/APA7 Base Template.docx
+++ b/app/domain/APA7 Base Template.docx
@@ -71,7 +71,7 @@
     </w:p>
     <w:p>
       <w:pPr>
-        <w:pStyle w:val="Heading1"/>
+        <w:pStyle w:val="HeadingFrontPage"/>
       </w:pPr>
       <w:r>
         <w:t>Abstract</w:t>
@@ -79,7 +79,7 @@
     </w:p>
     <w:p>
       <w:pPr>
-        <w:ind w:firstLine="0"/>
+        <w:pStyle w:val="FrontPageText"/>
       </w:pPr>
       <w:r>
         <w:t>This abstract is a single unindented paragraph of no more than 250 words summarising the paper topic, method, results, and conclusions. Replace this guidance text with the manuscript abstract.</w:t>
@@ -87,11 +87,11 @@
     </w:p>
     <w:p>
       <w:pPr>
-        <w:ind w:left="720"/>
+        <w:pStyle w:val="Keywords"/>
       </w:pPr>
       <w:r>
         <w:rPr>
-          <w:i/>
+          <w:rStyle w:val="KeywordsLabel"/>
         </w:rPr>
         <w:t>Keywords:</w:t>
       </w:r>
@@ -12605,6 +12605,64 @@
       <w:rFonts w:ascii="Calibri" w:hAnsi="Calibri" w:cs="Calibri"/>
       <w:b w:val="0"/>
       <w:i w:val="0"/>
+      <w:sz w:val="22"/>
+      <w:szCs w:val="22"/>
+    </w:rPr>
+  </w:style>
+  <w:style w:type="paragraph" w:customStyle="1" w:styleId="HeadingFrontPage">
+    <w:name w:val="Heading Front Page"/>
+    <w:basedOn w:val="Normal"/>
+    <w:pPr>
+      <w:ind w:left="0" w:firstLine="0"/>
+      <w:spacing w:line="480" w:lineRule="auto" w:after="0"/>
+      <w:keepNext/>
+      <w:jc w:val="center"/>
+    </w:pPr>
+    <w:rPr>
+      <w:rFonts w:ascii="Calibri" w:hAnsi="Calibri" w:cs="Calibri"/>
+      <w:b/>
+      <w:i w:val="0"/>
+      <w:sz w:val="22"/>
+      <w:szCs w:val="22"/>
+    </w:rPr>
+  </w:style>
+  <w:style w:type="paragraph" w:customStyle="1" w:styleId="FrontPageText">
+    <w:name w:val="Front Page Text"/>
+    <w:basedOn w:val="Normal"/>
+    <w:pPr>
+      <w:ind w:left="0" w:firstLine="0"/>
+      <w:spacing w:line="480" w:lineRule="auto" w:after="0"/>
+      <w:jc w:val="left"/>
+    </w:pPr>
+    <w:rPr>
+      <w:rFonts w:ascii="Calibri" w:hAnsi="Calibri" w:cs="Calibri"/>
+      <w:b w:val="0"/>
+      <w:i w:val="0"/>
+      <w:sz w:val="22"/>
+      <w:szCs w:val="22"/>
+    </w:rPr>
+  </w:style>
+  <w:style w:type="paragraph" w:customStyle="1" w:styleId="Keywords">
+    <w:name w:val="Keywords"/>
+    <w:basedOn w:val="Normal"/>
+    <w:pPr>
+      <w:ind w:left="720" w:firstLine="0"/>
+      <w:spacing w:line="480" w:lineRule="auto" w:after="0"/>
+      <w:jc w:val="left"/>
+    </w:pPr>
+    <w:rPr>
+      <w:rFonts w:ascii="Calibri" w:hAnsi="Calibri" w:cs="Calibri"/>
+      <w:b w:val="0"/>
+      <w:i w:val="0"/>
+      <w:sz w:val="22"/>
+      <w:szCs w:val="22"/>
+    </w:rPr>
+  </w:style>
+  <w:style w:type="character" w:customStyle="1" w:styleId="KeywordsLabel">
+    <w:name w:val="Keywords Label"/>
+    <w:rPr>
+      <w:rFonts w:ascii="Calibri" w:hAnsi="Calibri" w:cs="Calibri"/>
+      <w:i/>
       <w:sz w:val="22"/>
       <w:szCs w:val="22"/>
     </w:rPr>

</xml_diff>